<commit_message>
add new files and folders
</commit_message>
<xml_diff>
--- a/SAP ABAP 2026.docx
+++ b/SAP ABAP 2026.docx
@@ -49,22 +49,76 @@
           <w:szCs w:val="24"/>
           <w:highlight w:val="yellow"/>
         </w:rPr>
-        <w:t>Why we need of package?</w:t>
-      </w:r>
-    </w:p>
-    <w:p>
-      <w:pPr>
-        <w:rPr>
-          <w:sz w:val="24"/>
-          <w:szCs w:val="24"/>
-        </w:rPr>
-      </w:pPr>
-      <w:r>
-        <w:rPr>
-          <w:sz w:val="24"/>
-          <w:szCs w:val="24"/>
-        </w:rPr>
-        <w:t>To store the object which are created inside the SAP system.</w:t>
+        <w:t xml:space="preserve">Why </w:t>
+      </w:r>
+      <w:r>
+        <w:rPr>
+          <w:b/>
+          <w:bCs/>
+          <w:sz w:val="24"/>
+          <w:szCs w:val="24"/>
+          <w:highlight w:val="yellow"/>
+        </w:rPr>
+        <w:t xml:space="preserve">do </w:t>
+      </w:r>
+      <w:r>
+        <w:rPr>
+          <w:b/>
+          <w:bCs/>
+          <w:sz w:val="24"/>
+          <w:szCs w:val="24"/>
+          <w:highlight w:val="yellow"/>
+        </w:rPr>
+        <w:t xml:space="preserve">we need </w:t>
+      </w:r>
+      <w:r>
+        <w:rPr>
+          <w:b/>
+          <w:bCs/>
+          <w:sz w:val="24"/>
+          <w:szCs w:val="24"/>
+          <w:highlight w:val="yellow"/>
+        </w:rPr>
+        <w:t>a</w:t>
+      </w:r>
+      <w:r>
+        <w:rPr>
+          <w:b/>
+          <w:bCs/>
+          <w:sz w:val="24"/>
+          <w:szCs w:val="24"/>
+          <w:highlight w:val="yellow"/>
+        </w:rPr>
+        <w:t xml:space="preserve"> package?</w:t>
+      </w:r>
+    </w:p>
+    <w:p>
+      <w:pPr>
+        <w:rPr>
+          <w:sz w:val="24"/>
+          <w:szCs w:val="24"/>
+        </w:rPr>
+      </w:pPr>
+      <w:r>
+        <w:rPr>
+          <w:sz w:val="24"/>
+          <w:szCs w:val="24"/>
+        </w:rPr>
+        <w:t xml:space="preserve">To store the </w:t>
+      </w:r>
+      <w:r>
+        <w:rPr>
+          <w:sz w:val="24"/>
+          <w:szCs w:val="24"/>
+        </w:rPr>
+        <w:t>objects that</w:t>
+      </w:r>
+      <w:r>
+        <w:rPr>
+          <w:sz w:val="24"/>
+          <w:szCs w:val="24"/>
+        </w:rPr>
+        <w:t xml:space="preserve"> are created inside the SAP system.</w:t>
       </w:r>
     </w:p>
     <w:p>
@@ -121,7 +175,49 @@
           <w:sz w:val="24"/>
           <w:szCs w:val="24"/>
         </w:rPr>
-        <w:t xml:space="preserve">Firstly, we need to create the package for that we need to navigate on ‘Package Builder: Initial Screen’ </w:t>
+        <w:t>Firstly, we need to create the package</w:t>
+      </w:r>
+      <w:r>
+        <w:rPr>
+          <w:sz w:val="24"/>
+          <w:szCs w:val="24"/>
+        </w:rPr>
+        <w:t>,</w:t>
+      </w:r>
+      <w:r>
+        <w:rPr>
+          <w:sz w:val="24"/>
+          <w:szCs w:val="24"/>
+        </w:rPr>
+        <w:t xml:space="preserve"> </w:t>
+      </w:r>
+      <w:r>
+        <w:rPr>
+          <w:sz w:val="24"/>
+          <w:szCs w:val="24"/>
+        </w:rPr>
+        <w:t>so</w:t>
+      </w:r>
+      <w:r>
+        <w:rPr>
+          <w:sz w:val="24"/>
+          <w:szCs w:val="24"/>
+        </w:rPr>
+        <w:t xml:space="preserve"> we need to navigate </w:t>
+      </w:r>
+      <w:r>
+        <w:rPr>
+          <w:sz w:val="24"/>
+          <w:szCs w:val="24"/>
+        </w:rPr>
+        <w:t>to</w:t>
+      </w:r>
+      <w:r>
+        <w:rPr>
+          <w:sz w:val="24"/>
+          <w:szCs w:val="24"/>
+        </w:rPr>
+        <w:t xml:space="preserve"> ‘Package Builder: Initial Screen’ </w:t>
       </w:r>
     </w:p>
     <w:p>
@@ -177,7 +273,35 @@
           <w:sz w:val="24"/>
           <w:szCs w:val="24"/>
         </w:rPr>
-        <w:t>After that provide the name. (We can use the underscore for the create the package name)</w:t>
+        <w:t>After that</w:t>
+      </w:r>
+      <w:r>
+        <w:rPr>
+          <w:sz w:val="24"/>
+          <w:szCs w:val="24"/>
+        </w:rPr>
+        <w:t>,</w:t>
+      </w:r>
+      <w:r>
+        <w:rPr>
+          <w:sz w:val="24"/>
+          <w:szCs w:val="24"/>
+        </w:rPr>
+        <w:t xml:space="preserve"> provide the name. (We can use the underscore </w:t>
+      </w:r>
+      <w:r>
+        <w:rPr>
+          <w:sz w:val="24"/>
+          <w:szCs w:val="24"/>
+        </w:rPr>
+        <w:t>to</w:t>
+      </w:r>
+      <w:r>
+        <w:rPr>
+          <w:sz w:val="24"/>
+          <w:szCs w:val="24"/>
+        </w:rPr>
+        <w:t xml:space="preserve"> create the package name)</w:t>
       </w:r>
     </w:p>
     <w:p>
@@ -280,7 +404,21 @@
           <w:sz w:val="24"/>
           <w:szCs w:val="24"/>
         </w:rPr>
-        <w:t>Then choose the TR from list.</w:t>
+        <w:t xml:space="preserve">Then choose the TR from </w:t>
+      </w:r>
+      <w:r>
+        <w:rPr>
+          <w:sz w:val="24"/>
+          <w:szCs w:val="24"/>
+        </w:rPr>
+        <w:t xml:space="preserve">the </w:t>
+      </w:r>
+      <w:r>
+        <w:rPr>
+          <w:sz w:val="24"/>
+          <w:szCs w:val="24"/>
+        </w:rPr>
+        <w:t>list.</w:t>
       </w:r>
     </w:p>
     <w:p>
@@ -338,7 +476,25 @@
           <w:sz w:val="24"/>
           <w:szCs w:val="24"/>
         </w:rPr>
-        <w:t>Create package with:</w:t>
+        <w:t xml:space="preserve">Create </w:t>
+      </w:r>
+      <w:r>
+        <w:rPr>
+          <w:b/>
+          <w:bCs/>
+          <w:sz w:val="24"/>
+          <w:szCs w:val="24"/>
+        </w:rPr>
+        <w:t xml:space="preserve">a </w:t>
+      </w:r>
+      <w:r>
+        <w:rPr>
+          <w:b/>
+          <w:bCs/>
+          <w:sz w:val="24"/>
+          <w:szCs w:val="24"/>
+        </w:rPr>
+        <w:t>package with:</w:t>
       </w:r>
     </w:p>
     <w:p>
@@ -528,7 +684,7 @@
           <w:sz w:val="24"/>
           <w:szCs w:val="24"/>
         </w:rPr>
-        <w:t xml:space="preserve">Process of the creating </w:t>
+        <w:t xml:space="preserve">Process of creating </w:t>
       </w:r>
       <w:r>
         <w:rPr>
@@ -612,7 +768,21 @@
           <w:sz w:val="24"/>
           <w:szCs w:val="24"/>
         </w:rPr>
-        <w:t>Click on ‘</w:t>
+        <w:t xml:space="preserve">Click on </w:t>
+      </w:r>
+      <w:r>
+        <w:rPr>
+          <w:sz w:val="24"/>
+          <w:szCs w:val="24"/>
+        </w:rPr>
+        <w:t xml:space="preserve">the </w:t>
+      </w:r>
+      <w:r>
+        <w:rPr>
+          <w:sz w:val="24"/>
+          <w:szCs w:val="24"/>
+        </w:rPr>
+        <w:t>‘</w:t>
       </w:r>
       <w:r>
         <w:rPr>
@@ -682,7 +852,14 @@
           <w:sz w:val="24"/>
           <w:szCs w:val="24"/>
         </w:rPr>
-        <w:t>Customizing Request</w:t>
+        <w:t>Customising</w:t>
+      </w:r>
+      <w:r>
+        <w:rPr>
+          <w:sz w:val="24"/>
+          <w:szCs w:val="24"/>
+        </w:rPr>
+        <w:t xml:space="preserve"> Request</w:t>
       </w:r>
     </w:p>
     <w:p>
@@ -754,7 +931,21 @@
           <w:sz w:val="24"/>
           <w:szCs w:val="24"/>
         </w:rPr>
-        <w:t>Then click on ‘</w:t>
+        <w:t xml:space="preserve">Then click on </w:t>
+      </w:r>
+      <w:r>
+        <w:rPr>
+          <w:sz w:val="24"/>
+          <w:szCs w:val="24"/>
+        </w:rPr>
+        <w:t xml:space="preserve">the </w:t>
+      </w:r>
+      <w:r>
+        <w:rPr>
+          <w:sz w:val="24"/>
+          <w:szCs w:val="24"/>
+        </w:rPr>
+        <w:t>‘</w:t>
       </w:r>
       <w:r>
         <w:rPr>
@@ -828,17 +1019,47 @@
           <w:szCs w:val="24"/>
         </w:rPr>
       </w:pPr>
-      <w:proofErr w:type="gramStart"/>
-      <w:r>
-        <w:rPr>
-          <w:b/>
-          <w:bCs/>
-          <w:sz w:val="24"/>
-          <w:szCs w:val="24"/>
-        </w:rPr>
-        <w:t>Note :</w:t>
-      </w:r>
-      <w:proofErr w:type="gramEnd"/>
+      <w:r>
+        <w:rPr>
+          <w:b/>
+          <w:bCs/>
+          <w:sz w:val="24"/>
+          <w:szCs w:val="24"/>
+        </w:rPr>
+        <w:t xml:space="preserve">Note: </w:t>
+      </w:r>
+      <w:r>
+        <w:rPr>
+          <w:sz w:val="24"/>
+          <w:szCs w:val="24"/>
+        </w:rPr>
+        <w:t xml:space="preserve">If we want to change the </w:t>
+      </w:r>
+      <w:r>
+        <w:rPr>
+          <w:sz w:val="24"/>
+          <w:szCs w:val="24"/>
+        </w:rPr>
+        <w:t xml:space="preserve">description of the </w:t>
+      </w:r>
+      <w:r>
+        <w:rPr>
+          <w:b/>
+          <w:bCs/>
+          <w:sz w:val="24"/>
+          <w:szCs w:val="24"/>
+        </w:rPr>
+        <w:t>TR</w:t>
+      </w:r>
+      <w:r>
+        <w:rPr>
+          <w:b/>
+          <w:bCs/>
+          <w:sz w:val="24"/>
+          <w:szCs w:val="24"/>
+        </w:rPr>
+        <w:t>,</w:t>
+      </w:r>
       <w:r>
         <w:rPr>
           <w:b/>
@@ -847,29 +1068,6 @@
           <w:szCs w:val="24"/>
         </w:rPr>
         <w:t xml:space="preserve"> </w:t>
-      </w:r>
-      <w:r>
-        <w:rPr>
-          <w:sz w:val="24"/>
-          <w:szCs w:val="24"/>
-        </w:rPr>
-        <w:t xml:space="preserve">If we want to change the </w:t>
-      </w:r>
-      <w:r>
-        <w:rPr>
-          <w:sz w:val="24"/>
-          <w:szCs w:val="24"/>
-        </w:rPr>
-        <w:t xml:space="preserve">description of the </w:t>
-      </w:r>
-      <w:r>
-        <w:rPr>
-          <w:b/>
-          <w:bCs/>
-          <w:sz w:val="24"/>
-          <w:szCs w:val="24"/>
-        </w:rPr>
-        <w:t xml:space="preserve">TR </w:t>
       </w:r>
       <w:r>
         <w:rPr>
@@ -5570,7 +5768,7 @@
               </v:handles>
               <o:lock v:ext="edit" text="t" shapetype="t"/>
             </v:shapetype>
-            <v:shape id="PowerPlusWaterMarkObject14339392" o:spid="_x0000_s1025" type="#_x0000_t136" style="position:absolute;margin-left:0;margin-top:0;width:462.75pt;height:173.5pt;rotation:315;z-index:-251657216;mso-position-horizontal:center;mso-position-horizontal-relative:margin;mso-position-vertical:center;mso-position-vertical-relative:margin" o:allowincell="f" fillcolor="silver" stroked="f">
+            <v:shape id="PowerPlusWaterMarkObject14339392" o:spid="_x0000_s1025" type="#_x0000_t136" style="position:absolute;margin-left:0;margin-top:0;width:462.75pt;height:173.5pt;rotation:315;z-index:-251658752;mso-position-horizontal:center;mso-position-horizontal-relative:margin;mso-position-vertical:center;mso-position-vertical-relative:margin" o:allowincell="f" fillcolor="silver" stroked="f">
               <v:fill opacity=".5"/>
               <v:textpath style="font-family:&quot;Calibri&quot;;font-size:1pt" string="SHUBHAM"/>
               <w10:wrap anchorx="margin" anchory="margin"/>

</xml_diff>